<commit_message>
Master résumé rewritten from the impact ledger (seven years, counts on every bullet); LinkedIn banner in the portfolio system
Co-Authored-By: Claude Fable 5.1 <noreply@anthropic.com>
Claude-Session: https://claude.ai/code/session_011cenfH2z2DYzVLTBVS3oTj
</commit_message>
<xml_diff>
--- a/engine/Mousa-Batarseh-Resume-master.docx
+++ b/engine/Mousa-Batarseh-Resume-master.docx
@@ -34,7 +34,7 @@
           <w:sz w:val="21"/>
           <w:szCs w:val="21"/>
         </w:rPr>
-        <w:t xml:space="preserve">E-Commerce Specialist  ·  Shopify / WooCommerce  ·  WordPress / Elementor  ·  Product Data &amp; CSV Imports  ·  Google Analytics (GA4)  ·  SEO</w:t>
+        <w:t>Webmaster / E-Commerce Specialist  ·  Shopify / WooCommerce  ·  WordPress / Elementor  ·  Product Data &amp; CSV Imports  ·  Google Analytics (GA4)  ·  SEO</w:t>
       </w:r>
     </w:p>
     <w:p>
@@ -82,7 +82,7 @@
           <w:sz w:val="20"/>
           <w:szCs w:val="20"/>
         </w:rPr>
-        <w:t xml:space="preserve">E-commerce specialist with six years running Shopify, WooCommerce and WordPress storefronts end to end for multi-brand and multi-location retailers. Migrated and maintained catalogs exceeding 14,000 SKUs by bulk CSV — pricing, collections, categories, descriptions, images and SEO metadata — and preserved URL structure and redirects through platform migrations. Build and customize WordPress/Elementor sites, landing pages and seasonal promotions; report in Google Analytics (GA4) and Search Console.</w:t>
+        <w:t>Webmaster and e-commerce specialist with seven years running Shopify, WooCommerce and WordPress storefronts end to end for multi-brand and multi-location retailers. I find what’s costing a store sales and ship the fix, with the check that keeps it fixed: catalogs of 14,000+ SKUs migrated and maintained by bulk CSV (pricing, collections, categories, descriptions, images, SEO metadata), redirects and URL structure carried through two platform migrations, promotions and product data QA’d before they go live, reporting in GA4 and Search Console.</w:t>
       </w:r>
     </w:p>
     <w:p>
@@ -102,15 +102,15 @@
           <w:sz w:val="19"/>
           <w:szCs w:val="19"/>
         </w:rPr>
-        <w:t xml:space="preserve">Digital shelf reviews:</w:t>
-      </w:r>
-      <w:r>
-        <w:rPr>
-          <w:rFonts w:ascii="Calibri" w:cs="Calibri" w:eastAsia="Calibri" w:hAnsi="Calibri"/>
-          <w:sz w:val="19"/>
-          <w:szCs w:val="19"/>
-        </w:rPr>
-        <w:t xml:space="preserve"> independent, evidence-backed reviews of live e-commerce sites with working prototypes — portfolio at mousabatarseh.com.</w:t>
+        <w:t>Independent storefront reviews:</w:t>
+      </w:r>
+      <w:r>
+        <w:rPr>
+          <w:rFonts w:ascii="Calibri" w:cs="Calibri" w:eastAsia="Calibri" w:hAnsi="Calibri"/>
+          <w:sz w:val="19"/>
+          <w:szCs w:val="19"/>
+        </w:rPr>
+        <w:t xml:space="preserve"> 25 evidence-backed reviews of live stores, each with counted findings and working fixes, scored on the same 29-check rubric as ShelfMark (21 Michigan stores benchmarked) — mousabatarseh.com/reviews · mousabatarseh.com/method.</w:t>
       </w:r>
     </w:p>
     <w:p>
@@ -189,7 +189,7 @@
           <w:sz w:val="19"/>
           <w:szCs w:val="19"/>
         </w:rPr>
-        <w:t xml:space="preserve">Administer two corporate websites and the wholesale B2B e-commerce store (WordPress, WooCommerce, Elementor); operate a ~9,000-product catalog — accuracy, pricing, descriptions and imagery.</w:t>
+        <w:t>Administered two corporate websites and the wholesale B2B store (WordPress, WooCommerce, Elementor); operated a ~9,000-product catalog — accuracy, pricing, descriptions and imagery — for a 200+ location retailer.</w:t>
       </w:r>
     </w:p>
     <w:p>
@@ -207,7 +207,7 @@
           <w:sz w:val="19"/>
           <w:szCs w:val="19"/>
         </w:rPr>
-        <w:t xml:space="preserve">Design and launch new sites, landing pages, and seasonal/promotional campaign pages; coordinate launch readiness with marketing and merchandising.</w:t>
+        <w:t>Designed and launched new sites, landing pages and seasonal/promotional campaign pages; coordinated launch readiness with marketing and merchandising, with a pre-launch check per page.</w:t>
       </w:r>
     </w:p>
     <w:p>
@@ -225,7 +225,7 @@
           <w:sz w:val="19"/>
           <w:szCs w:val="19"/>
         </w:rPr>
-        <w:t xml:space="preserve">Customize WordPress themes with Elementor and custom code; optimize SEO metadata and page performance; report in GA4 and Search Console.</w:t>
+        <w:t>Customized WordPress themes with Elementor and custom code; owned SEO metadata and page performance; reported traffic and search performance in GA4 and Search Console.</w:t>
       </w:r>
     </w:p>
     <w:p>
@@ -243,7 +243,7 @@
           <w:sz w:val="19"/>
           <w:szCs w:val="19"/>
         </w:rPr>
-        <w:t xml:space="preserve">Build custom forms and lead-capture pages; maintain core/themes/plugins; apply QA, accessibility, security and change-management practices.</w:t>
+        <w:t>Built custom forms and lead-capture pages; maintained core, themes and plugins; applied QA, accessibility, security and change-management practices across every release.</w:t>
       </w:r>
     </w:p>
     <w:p>
@@ -302,7 +302,7 @@
           <w:sz w:val="19"/>
           <w:szCs w:val="19"/>
         </w:rPr>
-        <w:t xml:space="preserve">Built, launched and operated Shopify and WordPress storefronts for two brands simultaneously; planned architecture, navigation and conversion paths.</w:t>
+        <w:t>Built, launched and operated Shopify and WordPress storefronts for two brands simultaneously; planned architecture, navigation and conversion paths; ran the day-to-day operation for five years.</w:t>
       </w:r>
     </w:p>
     <w:p>
@@ -320,25 +320,7 @@
           <w:sz w:val="19"/>
           <w:szCs w:val="19"/>
         </w:rPr>
-        <w:t xml:space="preserve">Migrated thousands of products by bulk CSV; maintained catalogs of </w:t>
-      </w:r>
-      <w:r>
-        <w:rPr>
-          <w:rFonts w:ascii="Calibri" w:cs="Calibri" w:eastAsia="Calibri" w:hAnsi="Calibri"/>
-          <w:b/>
-          <w:bCs/>
-          <w:sz w:val="19"/>
-          <w:szCs w:val="19"/>
-        </w:rPr>
-        <w:t xml:space="preserve">14,000+ SKUs</w:t>
-      </w:r>
-      <w:r>
-        <w:rPr>
-          <w:rFonts w:ascii="Calibri" w:cs="Calibri" w:eastAsia="Calibri" w:hAnsi="Calibri"/>
-          <w:sz w:val="19"/>
-          <w:szCs w:val="19"/>
-        </w:rPr>
-        <w:t xml:space="preserve"> — pricing, collections, categories, descriptions, images and SEO metadata.</w:t>
+        <w:t>Migrated 1,000 products from an offline inventory system into a new Shopify store (United Textile); maintained catalogs of 14,000+ SKUs by bulk CSV — pricing, collections, categories, descriptions, images and SEO metadata.</w:t>
       </w:r>
     </w:p>
     <w:p>
@@ -356,7 +338,7 @@
           <w:sz w:val="19"/>
           <w:szCs w:val="19"/>
         </w:rPr>
-        <w:t xml:space="preserve">Managed redirects and URL structure through migrations; led the RepZio B2B platform migration; improved organic rankings to Google pages 1–2 within the first year.</w:t>
+        <w:t>Led the RepZio B2B platform migration with a full redirect map; kept URL structure intact through migrations; took target queries to Google pages 1–2 within the first year.</w:t>
       </w:r>
     </w:p>
     <w:p>
@@ -374,7 +356,7 @@
           <w:sz w:val="19"/>
           <w:szCs w:val="19"/>
         </w:rPr>
-        <w:t xml:space="preserve">Designed banners and Mailchimp email assets, created coupons, and ran the seasonal promo calendar; built wholesale registration workflows and coordinated with the warehouse.</w:t>
+        <w:t>Ran the seasonal promo calendar — banners, Mailchimp email assets and coupons — and built the wholesale registration workflow; coordinated fulfillment with the warehouse.</w:t>
       </w:r>
     </w:p>
     <w:p>
@@ -393,7 +375,7 @@
           <w:sz w:val="20"/>
           <w:szCs w:val="20"/>
         </w:rPr>
-        <w:t xml:space="preserve">Independent Web Developer &amp; E-Commerce Consultant</w:t>
+        <w:t>Independent Web Developer &amp; E-Commerce Consultant</w:t>
       </w:r>
       <w:r>
         <w:rPr>
@@ -402,18 +384,19 @@
           <w:sz w:val="18"/>
           <w:szCs w:val="18"/>
         </w:rPr>
-        <w:t xml:space="preserve">  |  Remote — digital-shelf reviews, ASAS Studio (4,038 Elementor templates), The Lab (catalog tooling)</w:t>
-      </w:r>
-      <w:r>
-        <w:rPr>
-          <w:rFonts w:ascii="Calibri" w:cs="Calibri" w:eastAsia="Calibri" w:hAnsi="Calibri"/>
-          <w:b/>
-          <w:bCs/>
-          <w:color w:val="555555"/>
-          <w:sz w:val="19"/>
-          <w:szCs w:val="19"/>
-        </w:rPr>
-        <w:t xml:space="preserve">	2019 – Present</w:t>
+        <w:t xml:space="preserve">  |  Remote — 25 storefront reviews (one led to an interview) · ShelfMark, a 29-check benchmark of 21 stores · The Deals OS, a 16-check promotion QA · ASAS Studio (3,881 Elementor blocks)</w:t>
+      </w:r>
+      <w:r>
+        <w:rPr>
+          <w:rFonts w:ascii="Calibri" w:cs="Calibri" w:eastAsia="Calibri" w:hAnsi="Calibri"/>
+          <w:b/>
+          <w:bCs/>
+          <w:color w:val="555555"/>
+          <w:sz w:val="19"/>
+          <w:szCs w:val="19"/>
+        </w:rPr>
+        <w:tab/>
+        <w:t>2019 – Present</w:t>
       </w:r>
     </w:p>
     <w:p>
@@ -551,7 +534,7 @@
           <w:sz w:val="19"/>
           <w:szCs w:val="19"/>
         </w:rPr>
-        <w:t xml:space="preserve">Shopify · WooCommerce · WordPress / Elementor · product data &amp; bulk CSV imports (14,000+ SKUs) · collections, categories &amp; pricing · redirects &amp; URL structure · coupons &amp; promotions · SEO metadata · Google Analytics (GA4) · Search Console</w:t>
+        <w:t>Shopify · WooCommerce · WordPress / Elementor · product data &amp; bulk CSV imports (14,000+ SKUs) · collections, categories &amp; pricing · redirects, canonicals &amp; URL structure · sitemaps &amp; structured data (JSON-LD) · coupons &amp; promotions · SEO metadata · Google Analytics (GA4) · Search Console</w:t>
       </w:r>
     </w:p>
     <w:p>
@@ -575,7 +558,7 @@
           <w:sz w:val="19"/>
           <w:szCs w:val="19"/>
         </w:rPr>
-        <w:t xml:space="preserve">Shopify · WordPress/WooCommerce · Elementor · BigCommerce · HTML/CSS/JavaScript · Excel/Sheets · Photoshop · GA4 · Search Console · GTM · SEO tools · AI-assisted workflows (Claude, ChatGPT)</w:t>
+        <w:t>Shopify · WordPress/WooCommerce · Elementor · BigCommerce · Magento (reviewed) · HTML/CSS/JavaScript · Python &amp; Excel/Sheets for catalog QA · Photoshop · GA4 · Search Console · GTM · SEO tools · AI-assisted workflows (Claude, ChatGPT)</w:t>
       </w:r>
     </w:p>
     <w:p>

</xml_diff>